<commit_message>
Add Irfan Mehmood as third author; update date; tidy Appendix F caption
</commit_message>
<xml_diff>
--- a/NMAFC-paper.docx
+++ b/NMAFC-paper.docx
@@ -19,13 +19,11 @@
         <w:jc w:val="center"/>
       </w:pPr>
       <w:r>
-        <w:t>Osamudiamen Edogun, Joshua Obigwe</w:t>
+        <w:t>Osamudiamen Edogun (Independent researcher), Joshua Obigwe (Independent researcher), Irfan Mehmood (University of Bradford)</w:t>
         <w:br/>
-        <w:t>Independent researcher</w:t>
+        <w:t>edogunosamudiamen@gmail.com, joshuaobigwe@gmail.com, I.Mehmood4@bradford.ac.uk</w:t>
         <w:br/>
-        <w:t>edogunosamudiamen@gmail.com, joshuaobigwe@gmail.com</w:t>
-        <w:br/>
-        <w:t>10 September 2026</w:t>
+        <w:t>9 October 2026</w:t>
       </w:r>
     </w:p>
     <w:p>
@@ -7919,7 +7917,7 @@
         <w:rPr>
           <w:sz w:val="19"/>
         </w:rPr>
-        <w:t>Everything released alongside this paper. The three scripts share no state and none of them contacts a model.</w:t>
+        <w:t>The files released with the paper for recomputing every number and figure in it. The scripts share no state and none of them contacts a model.</w:t>
       </w:r>
     </w:p>
     <w:tbl>

</xml_diff>